<commit_message>
Drop the 10K and move the start to Estádio JK
The race now has three events: a 3K walk open to everyone (medal for all
finishers), the 5K run with men's and women's rankings, and the Kids run.
Start, finish and the medal ceremony move to Estádio JK; clause 1.6.1 says
the venue still depends on public-authority confirmation and that any change
will be announced to registrants. The runner kit gains socks and a drawstring
bag, and the schedule announces live attractions.

Regulation (docx, pdf, site text), landing page, event config, worker vars,
and the #EUVOU card and PDF header art are regenerated to match.

Co-Authored-By: Claude Opus 5.5 <noreply@anthropic.com>
</commit_message>
<xml_diff>
--- a/regulamento/regulamento-corrida-flamanhu-2027.docx
+++ b/regulamento/regulamento-corrida-flamanhu-2027.docx
@@ -256,7 +256,7 @@
                 <w:sz w:val="21"/>
                 <w:szCs w:val="21"/>
               </w:rPr>
-              <w:t xml:space="preserve">Praça Cordovil Pinto Coelho, Centro – Manhuaçu/MG</w:t>
+              <w:t xml:space="preserve">Estádio Juscelino Kubitschek (Estádio JK) – Manhuaçu/MG (local de largada e chegada sujeito a confirmação, ver item 1.6.1)</w:t>
             </w:r>
           </w:p>
         </w:tc>
@@ -349,7 +349,7 @@
                 <w:sz w:val="21"/>
                 <w:szCs w:val="21"/>
               </w:rPr>
-              <w:t xml:space="preserve"> | Largadas 3,0km (caminhada), 5km e 10km: 09h</w:t>
+              <w:t xml:space="preserve"> | Largadas Caminhada 3km e Corrida 5km: 09h</w:t>
             </w:r>
           </w:p>
         </w:tc>
@@ -1022,7 +1022,7 @@
           <w:sz w:val="22"/>
           <w:szCs w:val="22"/>
         </w:rPr>
-        <w:t xml:space="preserve">A edição de 2027 será no dia 15/05/2027, na Praça Cordovil Pinto Coelho, Centro de Manhuaçu/MG. Podem participar pessoas de todos os sexos, torcedoras do Flamengo ou não, desde que devidamente inscritas e que respeitem este regulamento.</w:t>
+        <w:t xml:space="preserve">A edição de 2027 será no dia 15/05/2027, no Estádio Juscelino Kubitschek (Estádio JK), em Manhuaçu/MG. Podem participar pessoas de todos os sexos, torcedoras do Flamengo ou não, desde que devidamente inscritas e que respeitem este regulamento.</w:t>
       </w:r>
     </w:p>
     <w:p>
@@ -1060,7 +1060,67 @@
           <w:sz w:val="22"/>
           <w:szCs w:val="22"/>
         </w:rPr>
-        <w:t xml:space="preserve">A prova conta com as distâncias de 3,0km na modalidade Caminhada Participativa, 5km e 10km de corrida, além da Corrida Kids para as crianças.</w:t>
+        <w:t xml:space="preserve">O evento conta com três modalidades: </w:t>
+      </w:r>
+      <w:r>
+        <w:rPr>
+          <w:rFonts w:ascii="Calibri" w:cs="Calibri" w:eastAsia="Calibri" w:hAnsi="Calibri"/>
+          <w:b/>
+          <w:bCs/>
+          <w:color w:val="1A1A1A"/>
+          <w:sz w:val="22"/>
+          <w:szCs w:val="22"/>
+        </w:rPr>
+        <w:t xml:space="preserve">Caminhada 3km</w:t>
+      </w:r>
+      <w:r>
+        <w:rPr>
+          <w:rFonts w:ascii="Calibri" w:cs="Calibri" w:eastAsia="Calibri" w:hAnsi="Calibri"/>
+          <w:color w:val="1A1A1A"/>
+          <w:sz w:val="22"/>
+          <w:szCs w:val="22"/>
+        </w:rPr>
+        <w:t xml:space="preserve">, aberta a todos, com medalha para todos que cruzarem a linha de chegada; </w:t>
+      </w:r>
+      <w:r>
+        <w:rPr>
+          <w:rFonts w:ascii="Calibri" w:cs="Calibri" w:eastAsia="Calibri" w:hAnsi="Calibri"/>
+          <w:b/>
+          <w:bCs/>
+          <w:color w:val="1A1A1A"/>
+          <w:sz w:val="22"/>
+          <w:szCs w:val="22"/>
+        </w:rPr>
+        <w:t xml:space="preserve">Corrida 5km</w:t>
+      </w:r>
+      <w:r>
+        <w:rPr>
+          <w:rFonts w:ascii="Calibri" w:cs="Calibri" w:eastAsia="Calibri" w:hAnsi="Calibri"/>
+          <w:color w:val="1A1A1A"/>
+          <w:sz w:val="22"/>
+          <w:szCs w:val="22"/>
+        </w:rPr>
+        <w:t xml:space="preserve">, com classificação masculina e feminina; e </w:t>
+      </w:r>
+      <w:r>
+        <w:rPr>
+          <w:rFonts w:ascii="Calibri" w:cs="Calibri" w:eastAsia="Calibri" w:hAnsi="Calibri"/>
+          <w:b/>
+          <w:bCs/>
+          <w:color w:val="1A1A1A"/>
+          <w:sz w:val="22"/>
+          <w:szCs w:val="22"/>
+        </w:rPr>
+        <w:t xml:space="preserve">Corrida Kids</w:t>
+      </w:r>
+      <w:r>
+        <w:rPr>
+          <w:rFonts w:ascii="Calibri" w:cs="Calibri" w:eastAsia="Calibri" w:hAnsi="Calibri"/>
+          <w:color w:val="1A1A1A"/>
+          <w:sz w:val="22"/>
+          <w:szCs w:val="22"/>
+        </w:rPr>
+        <w:t xml:space="preserve">, para as crianças.</w:t>
       </w:r>
     </w:p>
     <w:p>
@@ -1098,7 +1158,45 @@
           <w:sz w:val="22"/>
           <w:szCs w:val="22"/>
         </w:rPr>
-        <w:t xml:space="preserve">A largada e a chegada acontecem na Praça Cordovil Pinto Coelho. O mapa do percurso será publicado no site oficial e nas redes sociais do evento antes da prova.</w:t>
+        <w:t xml:space="preserve">A largada e a chegada acontecem no Estádio JK, onde também será realizada a cerimônia de entrega de medalhas e premiação. O mapa do percurso será publicado no site oficial e nas redes sociais do evento antes da prova.</w:t>
+      </w:r>
+    </w:p>
+    <w:p>
+      <w:pPr>
+        <w:keepLines/>
+        <w:tabs>
+          <w:tab w:val="left" w:pos="1560"/>
+        </w:tabs>
+        <w:spacing w:after="100" w:before="0" w:line="276"/>
+        <w:ind w:left="1560" w:hanging="840"/>
+      </w:pPr>
+      <w:r>
+        <w:rPr>
+          <w:rFonts w:ascii="Calibri" w:cs="Calibri" w:eastAsia="Calibri" w:hAnsi="Calibri"/>
+          <w:b/>
+          <w:bCs/>
+          <w:color w:val="C8102E"/>
+          <w:sz w:val="22"/>
+          <w:szCs w:val="22"/>
+        </w:rPr>
+        <w:t xml:space="preserve">1.6.1</w:t>
+      </w:r>
+      <w:r>
+        <w:rPr>
+          <w:rFonts w:ascii="Calibri" w:cs="Calibri" w:eastAsia="Calibri" w:hAnsi="Calibri"/>
+          <w:sz w:val="22"/>
+          <w:szCs w:val="22"/>
+        </w:rPr>
+        <w:t xml:space="preserve">	</w:t>
+      </w:r>
+      <w:r>
+        <w:rPr>
+          <w:rFonts w:ascii="Calibri" w:cs="Calibri" w:eastAsia="Calibri" w:hAnsi="Calibri"/>
+          <w:color w:val="1A1A1A"/>
+          <w:sz w:val="22"/>
+          <w:szCs w:val="22"/>
+        </w:rPr>
+        <w:t xml:space="preserve">O local de largada e chegada está em fase de confirmação junto aos órgãos públicos competentes. Se for necessária alguma alteração, o novo local será em Manhuaçu/MG, mantidas a data e as modalidades, e será comunicado aos inscritos pelo site oficial, pelo Instagram @corrida_flamanhu e por e-mail ou WhatsApp, com antecedência.</w:t>
       </w:r>
     </w:p>
     <w:p>
@@ -1519,7 +1617,7 @@
                 <w:sz w:val="21"/>
                 <w:szCs w:val="21"/>
               </w:rPr>
-              <w:t xml:space="preserve">Largada oficial das provas de 3,0km, 5km e 10km</w:t>
+              <w:t xml:space="preserve">Largada oficial da Caminhada 3km e da Corrida 5km</w:t>
             </w:r>
           </w:p>
         </w:tc>
@@ -1590,7 +1688,7 @@
                 <w:sz w:val="21"/>
                 <w:szCs w:val="21"/>
               </w:rPr>
-              <w:t xml:space="preserve">Cerimônia de premiação</w:t>
+              <w:t xml:space="preserve">Cerimônia de entrega de medalhas e premiação, no Estádio JK</w:t>
             </w:r>
           </w:p>
         </w:tc>
@@ -1663,7 +1761,7 @@
                 <w:sz w:val="21"/>
                 <w:szCs w:val="21"/>
               </w:rPr>
-              <w:t xml:space="preserve">Celebração: música, festa e confraternização</w:t>
+              <w:t xml:space="preserve">Celebração com atrações ao vivo, música e confraternização</w:t>
             </w:r>
           </w:p>
         </w:tc>
@@ -1673,6 +1771,44 @@
       <w:pPr>
         <w:spacing w:after="140" w:before="0"/>
       </w:pPr>
+    </w:p>
+    <w:p>
+      <w:pPr>
+        <w:keepLines/>
+        <w:tabs>
+          <w:tab w:val="left" w:pos="720"/>
+        </w:tabs>
+        <w:spacing w:after="100" w:before="0" w:line="276"/>
+        <w:ind w:left="720" w:hanging="720"/>
+      </w:pPr>
+      <w:r>
+        <w:rPr>
+          <w:rFonts w:ascii="Calibri" w:cs="Calibri" w:eastAsia="Calibri" w:hAnsi="Calibri"/>
+          <w:b/>
+          <w:bCs/>
+          <w:color w:val="C8102E"/>
+          <w:sz w:val="22"/>
+          <w:szCs w:val="22"/>
+        </w:rPr>
+        <w:t xml:space="preserve">1.8</w:t>
+      </w:r>
+      <w:r>
+        <w:rPr>
+          <w:rFonts w:ascii="Calibri" w:cs="Calibri" w:eastAsia="Calibri" w:hAnsi="Calibri"/>
+          <w:sz w:val="22"/>
+          <w:szCs w:val="22"/>
+        </w:rPr>
+        <w:t xml:space="preserve">	</w:t>
+      </w:r>
+      <w:r>
+        <w:rPr>
+          <w:rFonts w:ascii="Calibri" w:cs="Calibri" w:eastAsia="Calibri" w:hAnsi="Calibri"/>
+          <w:color w:val="1A1A1A"/>
+          <w:sz w:val="22"/>
+          <w:szCs w:val="22"/>
+        </w:rPr>
+        <w:t xml:space="preserve">O evento terá atrações ao vivo. A programação será divulgada nas redes sociais oficiais do evento.</w:t>
+      </w:r>
     </w:p>
     <w:p>
       <w:pPr>
@@ -1752,7 +1888,7 @@
           <w:sz w:val="22"/>
           <w:szCs w:val="22"/>
         </w:rPr>
-        <w:t xml:space="preserve"> (5km e 10km): aberta a qualquer participante inscrito.</w:t>
+        <w:t xml:space="preserve"> (Corrida 5km): aberta a qualquer participante inscrito.</w:t>
       </w:r>
     </w:p>
     <w:p>
@@ -1801,7 +1937,7 @@
           <w:sz w:val="22"/>
           <w:szCs w:val="22"/>
         </w:rPr>
-        <w:t xml:space="preserve"> (5km e 10km): para pessoas com deficiência, mediante comprovação conforme o item 6.11.2.</w:t>
+        <w:t xml:space="preserve"> (Corrida 5km): para pessoas com deficiência, mediante comprovação conforme o item 6.11.2.</w:t>
       </w:r>
     </w:p>
     <w:p>
@@ -1850,7 +1986,7 @@
           <w:sz w:val="22"/>
           <w:szCs w:val="22"/>
         </w:rPr>
-        <w:t xml:space="preserve"> (5km e 10km): conforme as faixas descritas no item 8.4.</w:t>
+        <w:t xml:space="preserve"> (Corrida 5km): conforme as faixas descritas no item 8.4.</w:t>
       </w:r>
     </w:p>
     <w:p>
@@ -1939,16 +2075,16 @@
           <w:sz w:val="22"/>
           <w:szCs w:val="22"/>
         </w:rPr>
-        <w:t xml:space="preserve">Caminhada Participativa</w:t>
-      </w:r>
-      <w:r>
-        <w:rPr>
-          <w:rFonts w:ascii="Calibri" w:cs="Calibri" w:eastAsia="Calibri" w:hAnsi="Calibri"/>
-          <w:color w:val="1A1A1A"/>
-          <w:sz w:val="22"/>
-          <w:szCs w:val="22"/>
-        </w:rPr>
-        <w:t xml:space="preserve"> (3,0km) e </w:t>
+        <w:t xml:space="preserve">Caminhada 3km</w:t>
+      </w:r>
+      <w:r>
+        <w:rPr>
+          <w:rFonts w:ascii="Calibri" w:cs="Calibri" w:eastAsia="Calibri" w:hAnsi="Calibri"/>
+          <w:color w:val="1A1A1A"/>
+          <w:sz w:val="22"/>
+          <w:szCs w:val="22"/>
+        </w:rPr>
+        <w:t xml:space="preserve"> (geral, sem divisão por sexo) e </w:t>
       </w:r>
       <w:r>
         <w:rPr>
@@ -1968,7 +2104,7 @@
           <w:sz w:val="22"/>
           <w:szCs w:val="22"/>
         </w:rPr>
-        <w:t xml:space="preserve"> modalidades de caráter participativo, sem classificação por colocação.</w:t>
+        <w:t xml:space="preserve"> modalidades de caráter participativo, sem classificação por colocação. Todos que cruzarem a linha de chegada recebem medalha.</w:t>
       </w:r>
     </w:p>
     <w:p>
@@ -2873,7 +3009,7 @@
           <w:sz w:val="22"/>
           <w:szCs w:val="22"/>
         </w:rPr>
-        <w:t xml:space="preserve">5km:</w:t>
+        <w:t xml:space="preserve">Corrida 5km:</w:t>
       </w:r>
       <w:r>
         <w:rPr>
@@ -2903,37 +3039,7 @@
           <w:sz w:val="22"/>
           <w:szCs w:val="22"/>
         </w:rPr>
-        <w:t xml:space="preserve">10km:</w:t>
-      </w:r>
-      <w:r>
-        <w:rPr>
-          <w:rFonts w:ascii="Calibri" w:cs="Calibri" w:eastAsia="Calibri" w:hAnsi="Calibri"/>
-          <w:color w:val="1A1A1A"/>
-          <w:sz w:val="22"/>
-          <w:szCs w:val="22"/>
-        </w:rPr>
-        <w:t xml:space="preserve"> 16 anos completos até 31/12/2027.</w:t>
-      </w:r>
-    </w:p>
-    <w:p>
-      <w:pPr>
-        <w:pStyle w:val="ListParagraph"/>
-        <w:numPr>
-          <w:ilvl w:val="0"/>
-          <w:numId w:val="2"/>
-        </w:numPr>
-        <w:spacing w:after="60" w:before="0" w:line="276"/>
-      </w:pPr>
-      <w:r>
-        <w:rPr>
-          <w:rFonts w:ascii="Calibri" w:cs="Calibri" w:eastAsia="Calibri" w:hAnsi="Calibri"/>
-          <w:b/>
-          <w:bCs/>
-          <w:color w:val="1A1A1A"/>
-          <w:sz w:val="22"/>
-          <w:szCs w:val="22"/>
-        </w:rPr>
-        <w:t xml:space="preserve">Caminhada 3,0km:</w:t>
+        <w:t xml:space="preserve">Caminhada 3km:</w:t>
       </w:r>
       <w:r>
         <w:rPr>
@@ -5161,7 +5267,7 @@
                 <w:sz w:val="21"/>
                 <w:szCs w:val="21"/>
               </w:rPr>
-              <w:t xml:space="preserve">3,0km, 5km e 10km</w:t>
+              <w:t xml:space="preserve">Caminhada 3km e Corrida 5km</w:t>
             </w:r>
           </w:p>
         </w:tc>
@@ -5966,7 +6072,45 @@
           <w:sz w:val="22"/>
           <w:szCs w:val="22"/>
         </w:rPr>
-        <w:t xml:space="preserve">O kit contém camiseta oficial do evento, número de peito, chip de cronometragem </w:t>
+        <w:t xml:space="preserve">O kit do participante contém número de peito, chip de cronometragem, camisa oficial do evento, meia, saco-mochila e brindes de patrocinadores. Na Corrida Kids o kit não inclui chip (item 5.4). Quem não retirar no prazo perde o direito ao kit.</w:t>
+      </w:r>
+    </w:p>
+    <w:p>
+      <w:pPr>
+        <w:keepLines/>
+        <w:tabs>
+          <w:tab w:val="left" w:pos="720"/>
+        </w:tabs>
+        <w:spacing w:after="100" w:before="0" w:line="276"/>
+        <w:ind w:left="720" w:hanging="720"/>
+      </w:pPr>
+      <w:r>
+        <w:rPr>
+          <w:rFonts w:ascii="Calibri" w:cs="Calibri" w:eastAsia="Calibri" w:hAnsi="Calibri"/>
+          <w:b/>
+          <w:bCs/>
+          <w:color w:val="C8102E"/>
+          <w:sz w:val="22"/>
+          <w:szCs w:val="22"/>
+        </w:rPr>
+        <w:t xml:space="preserve">7.2</w:t>
+      </w:r>
+      <w:r>
+        <w:rPr>
+          <w:rFonts w:ascii="Calibri" w:cs="Calibri" w:eastAsia="Calibri" w:hAnsi="Calibri"/>
+          <w:sz w:val="22"/>
+          <w:szCs w:val="22"/>
+        </w:rPr>
+        <w:t xml:space="preserve">	</w:t>
+      </w:r>
+      <w:r>
+        <w:rPr>
+          <w:rFonts w:ascii="Calibri" w:cs="Calibri" w:eastAsia="Calibri" w:hAnsi="Calibri"/>
+          <w:color w:val="1A1A1A"/>
+          <w:sz w:val="22"/>
+          <w:szCs w:val="22"/>
+        </w:rPr>
+        <w:t xml:space="preserve">Datas e horários: </w:t>
       </w:r>
       <w:r>
         <w:rPr>
@@ -5977,54 +6121,16 @@
           <w:highlight w:val="yellow"/>
           <w:highlightCs w:val="yellow"/>
         </w:rPr>
-        <w:t xml:space="preserve">[, sacola]</w:t>
-      </w:r>
-      <w:r>
-        <w:rPr>
-          <w:rFonts w:ascii="Calibri" w:cs="Calibri" w:eastAsia="Calibri" w:hAnsi="Calibri"/>
-          <w:color w:val="1A1A1A"/>
-          <w:sz w:val="22"/>
-          <w:szCs w:val="22"/>
-        </w:rPr>
-        <w:t xml:space="preserve"> e possíveis brindes de patrocinadores. Quem não retirar no prazo perde o direito ao kit.</w:t>
-      </w:r>
-    </w:p>
-    <w:p>
-      <w:pPr>
-        <w:keepLines/>
-        <w:tabs>
-          <w:tab w:val="left" w:pos="720"/>
-        </w:tabs>
-        <w:spacing w:after="100" w:before="0" w:line="276"/>
-        <w:ind w:left="720" w:hanging="720"/>
-      </w:pPr>
-      <w:r>
-        <w:rPr>
-          <w:rFonts w:ascii="Calibri" w:cs="Calibri" w:eastAsia="Calibri" w:hAnsi="Calibri"/>
-          <w:b/>
-          <w:bCs/>
-          <w:color w:val="C8102E"/>
-          <w:sz w:val="22"/>
-          <w:szCs w:val="22"/>
-        </w:rPr>
-        <w:t xml:space="preserve">7.2</w:t>
-      </w:r>
-      <w:r>
-        <w:rPr>
-          <w:rFonts w:ascii="Calibri" w:cs="Calibri" w:eastAsia="Calibri" w:hAnsi="Calibri"/>
-          <w:sz w:val="22"/>
-          <w:szCs w:val="22"/>
-        </w:rPr>
-        <w:t xml:space="preserve">	</w:t>
-      </w:r>
-      <w:r>
-        <w:rPr>
-          <w:rFonts w:ascii="Calibri" w:cs="Calibri" w:eastAsia="Calibri" w:hAnsi="Calibri"/>
-          <w:color w:val="1A1A1A"/>
-          <w:sz w:val="22"/>
-          <w:szCs w:val="22"/>
-        </w:rPr>
-        <w:t xml:space="preserve">Datas e horários: </w:t>
+        <w:t xml:space="preserve">[13/05 das 14h às 20h e 14/05 das 09h às 18h]</w:t>
+      </w:r>
+      <w:r>
+        <w:rPr>
+          <w:rFonts w:ascii="Calibri" w:cs="Calibri" w:eastAsia="Calibri" w:hAnsi="Calibri"/>
+          <w:color w:val="1A1A1A"/>
+          <w:sz w:val="22"/>
+          <w:szCs w:val="22"/>
+        </w:rPr>
+        <w:t xml:space="preserve">. Local: </w:t>
       </w:r>
       <w:r>
         <w:rPr>
@@ -6035,26 +6141,6 @@
           <w:highlight w:val="yellow"/>
           <w:highlightCs w:val="yellow"/>
         </w:rPr>
-        <w:t xml:space="preserve">[13/05 das 14h às 20h e 14/05 das 09h às 18h]</w:t>
-      </w:r>
-      <w:r>
-        <w:rPr>
-          <w:rFonts w:ascii="Calibri" w:cs="Calibri" w:eastAsia="Calibri" w:hAnsi="Calibri"/>
-          <w:color w:val="1A1A1A"/>
-          <w:sz w:val="22"/>
-          <w:szCs w:val="22"/>
-        </w:rPr>
-        <w:t xml:space="preserve">. Local: </w:t>
-      </w:r>
-      <w:r>
-        <w:rPr>
-          <w:rFonts w:ascii="Calibri" w:cs="Calibri" w:eastAsia="Calibri" w:hAnsi="Calibri"/>
-          <w:color w:val="1A1A1A"/>
-          <w:sz w:val="22"/>
-          <w:szCs w:val="22"/>
-          <w:highlight w:val="yellow"/>
-          <w:highlightCs w:val="yellow"/>
-        </w:rPr>
         <w:t xml:space="preserve">[local de retirada]</w:t>
       </w:r>
       <w:r>
@@ -6216,7 +6302,7 @@
           <w:sz w:val="22"/>
           <w:szCs w:val="22"/>
         </w:rPr>
-        <w:t xml:space="preserve">A escolha do tamanho de camiseta é feita na inscrição. Se acabar o seu tamanho, vamos oferecer a melhor opção disponível no momento da retirada.</w:t>
+        <w:t xml:space="preserve">A escolha do tamanho da camisa é feita na inscrição. Se acabar o seu tamanho, vamos oferecer a melhor opção disponível no momento da retirada.</w:t>
       </w:r>
     </w:p>
     <w:p>
@@ -6292,7 +6378,7 @@
           <w:sz w:val="22"/>
           <w:szCs w:val="22"/>
         </w:rPr>
-        <w:t xml:space="preserve">A medalha de participação é entregue apenas para quem completar a prova e cruzar o pórtico de chegada.</w:t>
+        <w:t xml:space="preserve">A medalha de participação é entregue a todos que completarem a prova e cruzarem a linha de chegada, em todas as modalidades.</w:t>
       </w:r>
     </w:p>
     <w:p>
@@ -6402,7 +6488,7 @@
           <w:sz w:val="22"/>
           <w:szCs w:val="22"/>
         </w:rPr>
-        <w:t xml:space="preserve">Premiação em dinheiro — Geral 5km e 10km, masculino e feminino:</w:t>
+        <w:t xml:space="preserve">Premiação em dinheiro — Geral Corrida 5km, masculino e feminino:</w:t>
       </w:r>
     </w:p>
     <w:tbl>
@@ -6900,7 +6986,7 @@
           <w:sz w:val="22"/>
           <w:szCs w:val="22"/>
         </w:rPr>
-        <w:t xml:space="preserve">Categoria PCD — 5km e 10km, masculino e feminino:</w:t>
+        <w:t xml:space="preserve">Categoria PCD — Corrida 5km, masculino e feminino:</w:t>
       </w:r>
       <w:r>
         <w:rPr>
@@ -6949,7 +7035,7 @@
           <w:sz w:val="22"/>
           <w:szCs w:val="22"/>
         </w:rPr>
-        <w:t xml:space="preserve">Por faixa etária — 5km e 10km, masculino e feminino:</w:t>
+        <w:t xml:space="preserve">Por faixa etária — Corrida 5km, masculino e feminino:</w:t>
       </w:r>
       <w:r>
         <w:rPr>
@@ -7118,7 +7204,7 @@
           <w:sz w:val="22"/>
           <w:szCs w:val="22"/>
         </w:rPr>
-        <w:t xml:space="preserve">A Caminhada 3,0km não tem premiação por colocação. Todos que completam ganham medalha.</w:t>
+        <w:t xml:space="preserve">A Caminhada 3km não tem premiação por colocação. Todos que cruzarem a linha de chegada ganham medalha.</w:t>
       </w:r>
     </w:p>
     <w:p>
@@ -7626,7 +7712,7 @@
           <w:sz w:val="22"/>
           <w:szCs w:val="22"/>
         </w:rPr>
-        <w:t xml:space="preserve">É incentivado, mas não obrigatório, o uso da camiseta oficial do evento ou do manto rubro-negro durante a prova.</w:t>
+        <w:t xml:space="preserve">É incentivado, mas não obrigatório, o uso da camisa oficial do evento ou do manto rubro-negro durante a prova.</w:t>
       </w:r>
     </w:p>
     <w:p>

</xml_diff>